<commit_message>
DIP-7: Add web version to scope and fix language names in UX
</commit_message>
<xml_diff>
--- a/docs/project-management-and-risks.docx
+++ b/docs/project-management-and-risks.docx
@@ -376,7 +376,7 @@
                 <w:sz w:val="20"/>
                 <w:szCs w:val="20"/>
               </w:rPr>
-              <w:t xml:space="preserve">Mobile interface (screens, mockups, map) and the AI module (plan generation and AI assistant); project coordination: YouTrack, communication with the supervisor, risk management.</w:t>
+              <w:t xml:space="preserve">Client interface for mobile and web (screens, mockups, map) and the AI module (plan generation and AI assistant); project coordination: YouTrack, communication with the supervisor, risk management.</w:t>
             </w:r>
           </w:p>
         </w:tc>
@@ -1454,7 +1454,7 @@
           <w:sz w:val="24"/>
           <w:szCs w:val="24"/>
         </w:rPr>
-        <w:t xml:space="preserve">Mobile screens depend on the API defined by the backend; the API contract must be agreed before implementation.</w:t>
+        <w:t xml:space="preserve">Mobile and web screens depend on the API defined by the backend; the API contract must be agreed before implementation.</w:t>
       </w:r>
     </w:p>
     <w:p>
@@ -2906,6 +2906,157 @@
                 <w:szCs w:val="18"/>
               </w:rPr>
               <w:t xml:space="preserve">Yerassyl</w:t>
+            </w:r>
+          </w:p>
+        </w:tc>
+      </w:tr>
+      <w:tr>
+        <w:trPr>
+          <w:cantSplit/>
+          <w:tblHeader w:val="false"/>
+        </w:trPr>
+        <w:tc>
+          <w:tcPr>
+            <w:tcW w:type="dxa" w:w="1900"/>
+            <w:tcBorders>
+              <w:top w:val="single" w:color="000000" w:sz="4"/>
+              <w:left w:val="single" w:color="000000" w:sz="4"/>
+              <w:bottom w:val="single" w:color="000000" w:sz="4"/>
+              <w:right w:val="single" w:color="000000" w:sz="4"/>
+            </w:tcBorders>
+            <w:tcMar>
+              <w:top w:type="dxa" w:w="50"/>
+              <w:left w:type="dxa" w:w="80"/>
+              <w:bottom w:type="dxa" w:w="50"/>
+              <w:right w:type="dxa" w:w="80"/>
+            </w:tcMar>
+          </w:tcPr>
+          <w:p>
+            <w:r>
+              <w:rPr>
+                <w:rFonts w:ascii="Times New Roman" w:cs="Times New Roman" w:eastAsia="Times New Roman" w:hAnsi="Times New Roman"/>
+                <w:b w:val="false"/>
+                <w:bCs w:val="false"/>
+                <w:sz w:val="18"/>
+                <w:szCs w:val="18"/>
+              </w:rPr>
+              <w:t xml:space="preserve">Extra workload of the web version</w:t>
+            </w:r>
+          </w:p>
+        </w:tc>
+        <w:tc>
+          <w:tcPr>
+            <w:tcW w:type="dxa" w:w="900"/>
+            <w:tcBorders>
+              <w:top w:val="single" w:color="000000" w:sz="4"/>
+              <w:left w:val="single" w:color="000000" w:sz="4"/>
+              <w:bottom w:val="single" w:color="000000" w:sz="4"/>
+              <w:right w:val="single" w:color="000000" w:sz="4"/>
+            </w:tcBorders>
+            <w:tcMar>
+              <w:top w:type="dxa" w:w="50"/>
+              <w:left w:type="dxa" w:w="80"/>
+              <w:bottom w:type="dxa" w:w="50"/>
+              <w:right w:type="dxa" w:w="80"/>
+            </w:tcMar>
+          </w:tcPr>
+          <w:p>
+            <w:r>
+              <w:rPr>
+                <w:rFonts w:ascii="Times New Roman" w:cs="Times New Roman" w:eastAsia="Times New Roman" w:hAnsi="Times New Roman"/>
+                <w:b w:val="false"/>
+                <w:bCs w:val="false"/>
+                <w:sz w:val="18"/>
+                <w:szCs w:val="18"/>
+              </w:rPr>
+              <w:t xml:space="preserve">Medium</w:t>
+            </w:r>
+          </w:p>
+        </w:tc>
+        <w:tc>
+          <w:tcPr>
+            <w:tcW w:type="dxa" w:w="900"/>
+            <w:tcBorders>
+              <w:top w:val="single" w:color="000000" w:sz="4"/>
+              <w:left w:val="single" w:color="000000" w:sz="4"/>
+              <w:bottom w:val="single" w:color="000000" w:sz="4"/>
+              <w:right w:val="single" w:color="000000" w:sz="4"/>
+            </w:tcBorders>
+            <w:tcMar>
+              <w:top w:type="dxa" w:w="50"/>
+              <w:left w:type="dxa" w:w="80"/>
+              <w:bottom w:type="dxa" w:w="50"/>
+              <w:right w:type="dxa" w:w="80"/>
+            </w:tcMar>
+          </w:tcPr>
+          <w:p>
+            <w:r>
+              <w:rPr>
+                <w:rFonts w:ascii="Times New Roman" w:cs="Times New Roman" w:eastAsia="Times New Roman" w:hAnsi="Times New Roman"/>
+                <w:b w:val="false"/>
+                <w:bCs w:val="false"/>
+                <w:sz w:val="18"/>
+                <w:szCs w:val="18"/>
+              </w:rPr>
+              <w:t xml:space="preserve">Medium</w:t>
+            </w:r>
+          </w:p>
+        </w:tc>
+        <w:tc>
+          <w:tcPr>
+            <w:tcW w:type="dxa" w:w="3300"/>
+            <w:tcBorders>
+              <w:top w:val="single" w:color="000000" w:sz="4"/>
+              <w:left w:val="single" w:color="000000" w:sz="4"/>
+              <w:bottom w:val="single" w:color="000000" w:sz="4"/>
+              <w:right w:val="single" w:color="000000" w:sz="4"/>
+            </w:tcBorders>
+            <w:tcMar>
+              <w:top w:type="dxa" w:w="50"/>
+              <w:left w:type="dxa" w:w="80"/>
+              <w:bottom w:type="dxa" w:w="50"/>
+              <w:right w:type="dxa" w:w="80"/>
+            </w:tcMar>
+          </w:tcPr>
+          <w:p>
+            <w:r>
+              <w:rPr>
+                <w:rFonts w:ascii="Times New Roman" w:cs="Times New Roman" w:eastAsia="Times New Roman" w:hAnsi="Times New Roman"/>
+                <w:b w:val="false"/>
+                <w:bCs w:val="false"/>
+                <w:sz w:val="18"/>
+                <w:szCs w:val="18"/>
+              </w:rPr>
+              <w:t xml:space="preserve">One Flutter codebase for mobile and web; the web version reuses all screens and only adapts the layout; mobile is the priority if time is short</w:t>
+            </w:r>
+          </w:p>
+        </w:tc>
+        <w:tc>
+          <w:tcPr>
+            <w:tcW w:type="dxa" w:w="2026"/>
+            <w:tcBorders>
+              <w:top w:val="single" w:color="000000" w:sz="4"/>
+              <w:left w:val="single" w:color="000000" w:sz="4"/>
+              <w:bottom w:val="single" w:color="000000" w:sz="4"/>
+              <w:right w:val="single" w:color="000000" w:sz="4"/>
+            </w:tcBorders>
+            <w:tcMar>
+              <w:top w:type="dxa" w:w="50"/>
+              <w:left w:type="dxa" w:w="80"/>
+              <w:bottom w:type="dxa" w:w="50"/>
+              <w:right w:type="dxa" w:w="80"/>
+            </w:tcMar>
+          </w:tcPr>
+          <w:p>
+            <w:r>
+              <w:rPr>
+                <w:rFonts w:ascii="Times New Roman" w:cs="Times New Roman" w:eastAsia="Times New Roman" w:hAnsi="Times New Roman"/>
+                <w:b w:val="false"/>
+                <w:bCs w:val="false"/>
+                <w:sz w:val="18"/>
+                <w:szCs w:val="18"/>
+              </w:rPr>
+              <w:t xml:space="preserve">Sayakhat</w:t>
             </w:r>
           </w:p>
         </w:tc>

</xml_diff>